<commit_message>
Update Pooja Week 2 progress: last-week supervisor feedback and this-week response
Clarify Supervisor Feedback as feedback from the prior meeting, and document architecture/tech/initial paks-framework scaffolding work without claiming live AWS results.
</commit_message>
<xml_diff>
--- a/pooja-thesis/weekly_submissions/Pooja_25120921_Weekly_Progress_Week2.docx
+++ b/pooja-thesis/weekly_submissions/Pooja_25120921_Weekly_Progress_Week2.docx
@@ -135,7 +135,9 @@
           <w:vertAlign w:val="baseline"/>
           <w:rtl w:val="0"/>
         </w:rPr>
-        <w:t>Student Name: PoojaStudent ID: 25120921</w:t>
+        <w:t>Student Name: Pooja</w:t>
+        <w:tab/>
+        <w:t>Student ID: 25120921</w:t>
       </w:r>
       <w:r>
         <w:rPr>
@@ -482,7 +484,7 @@
           <w:szCs w:val="20"/>
           <w:rtl w:val="0"/>
         </w:rPr>
-        <w:t>Responded to Week 1 supervisor feedback by clarifying the project in plain terms: PAKS predicts the next workload step with an LSTM and scales earlier than reactive Kubernetes HPA, with a stability rule (smoothing, hysteresis, cooldown) so foresight does not thrash the cluster.</w:t>
+        <w:t>Responded to last week's supervisor feedback by clarifying the project story: PAKS predicts the next workload step with an LSTM and scales earlier than reactive Kubernetes HPA, with a stability rule (smoothing, hysteresis, cooldown) so foresight does not thrash the cluster.</w:t>
       </w:r>
     </w:p>
     <w:p>
@@ -514,7 +516,7 @@
           <w:szCs w:val="20"/>
           <w:rtl w:val="0"/>
         </w:rPr>
-        <w:t>Documented the system architecture for supervision: public GCT/Alibaba workload traces → LSTM next-step prediction → HPA vs PAKS scale decision → Kubernetes Scale update in dry-run for fair comparison (live AWS EC2/k3s only as a later confirmation path, not claimed as completed results).</w:t>
+        <w:t>Prepared a clear architecture explanation for supervision: public GCT/Alibaba workload traces → LSTM next-step prediction → HPA vs PAKS scale decision → Kubernetes Scale update in dry-run for fair comparison (live AWS EC2/k3s only as a later confirmation path, not claimed as completed results).</w:t>
       </w:r>
     </w:p>
     <w:p>
@@ -546,7 +548,7 @@
           <w:szCs w:val="20"/>
           <w:rtl w:val="0"/>
         </w:rPr>
-        <w:t>Listed the main technologies in the formal path: LSTM predictor, reactive HPA baseline, PAKS adaptive engine/stability controller, GCT and Alibaba traces, Python evaluation harness, and Kubernetes dry-run Scale API shapes.</w:t>
+        <w:t>Listed the technologies to be used: LSTM predictor, reactive HPA baseline, PAKS adaptive engine/stability controller, GCT and Alibaba traces, Python evaluation harness, and Kubernetes dry-run Scale API shapes.</w:t>
       </w:r>
     </w:p>
     <w:p>
@@ -578,7 +580,7 @@
           <w:szCs w:val="20"/>
           <w:rtl w:val="0"/>
         </w:rPr>
-        <w:t>Showed initial implementations already in the paks-framework repo: src/lambda_handler/app.py, src/models/lstm_predictor.py, src/k8s/adaptive_engine.py, src/models/scalers.py, scripts/train_lstm_and_evaluate.py, and supporting unit tests. Evaluation remains dry-run / initial code; full live AWS results are not claimed.</w:t>
+        <w:t>Prepared to show initial implementations from the paks-framework scaffolding: lambda_handler/app.py, lstm_predictor.py, adaptive_engine.py, scalers.py, train_lstm_and_evaluate.py, and supporting tests. Honest status: dry-run / scaffolding only; no finished live AWS results claimed.</w:t>
       </w:r>
     </w:p>
     <w:p>
@@ -610,7 +612,7 @@
           <w:szCs w:val="20"/>
           <w:rtl w:val="0"/>
         </w:rPr>
-        <w:t>Prepared the next research-plan step from the CA2 Gantt: lock the formal dry-run HPA vs PAKS comparison metrics on public traces (SLA, utilisation, scaling events, prediction error), then consider a small live k3s check only after dry-run numbers are stable.</w:t>
+        <w:t>Prepared the next research-plan step: lock formal dry-run HPA vs PAKS comparison metrics on public traces (SLA, utilisation, scaling events, prediction error), then consider a small live k3s check only after dry-run numbers are stable.</w:t>
       </w:r>
     </w:p>
     <w:p>
@@ -801,7 +803,7 @@
           <w:szCs w:val="20"/>
           <w:rtl w:val="0"/>
         </w:rPr>
-        <w:t>Carrying forward Week 1 supervisor feedback: present a clearer project explanation, architecture, technologies, and show initial implementations during this week's supervision session.</w:t>
+        <w:t>Last week's supervisor feedback: he asked me to be more clear about the project and to explain the implementation, architecture, and technologies I will be using.</w:t>
       </w:r>
     </w:p>
     <w:p>
@@ -833,7 +835,7 @@
           <w:szCs w:val="20"/>
           <w:rtl w:val="0"/>
         </w:rPr>
-        <w:t>This Week 2 report prepares that response from the current paks-framework scaffolding (dry-run path and initial code). Supervisor comments from this meeting will be added after the session.</w:t>
+        <w:t>He also said I need to show him some initial implementations.</w:t>
       </w:r>
     </w:p>
     <w:p>

</xml_diff>

<commit_message>
Rewrite Pooja Week2 report in early-week planning tone
Align summary with Nemi-style student bullets: clarify HPA vs PAKS
problem, prepare architecture/tech explanations, plan how to show
initial implementations once coding begins. Remove scaffolding,
dry-run, and file-path claims that code already exists.
</commit_message>
<xml_diff>
--- a/pooja-thesis/weekly_submissions/Pooja_25120921_Weekly_Progress_Week2.docx
+++ b/pooja-thesis/weekly_submissions/Pooja_25120921_Weekly_Progress_Week2.docx
@@ -484,7 +484,7 @@
           <w:szCs w:val="20"/>
           <w:rtl w:val="0"/>
         </w:rPr>
-        <w:t>Responded to last week's supervisor feedback by clarifying the project story: PAKS predicts the next workload step with an LSTM and scales earlier than reactive Kubernetes HPA, with a stability rule (smoothing, hysteresis, cooldown) so foresight does not thrash the cluster.</w:t>
+        <w:t>Clarified the project problem for supervision: Kubernetes HPA is reactive (scales after load appears), while the planned PAKS approach aims to predict the next workload step and scale earlier, with a stability rule so foresight does not thrash the cluster.</w:t>
       </w:r>
     </w:p>
     <w:p>
@@ -516,7 +516,7 @@
           <w:szCs w:val="20"/>
           <w:rtl w:val="0"/>
         </w:rPr>
-        <w:t>Prepared a clear architecture explanation for supervision: public GCT/Alibaba workload traces → LSTM next-step prediction → HPA vs PAKS scale decision → Kubernetes Scale update in dry-run for fair comparison (live AWS EC2/k3s only as a later confirmation path, not claimed as completed results).</w:t>
+        <w:t>Prepared an architecture explanation for the next meeting: public GCT/Alibaba workload traces → LSTM next-step prediction → HPA vs PAKS scale decision → Kubernetes Scale comparison path (live AWS/k3s only as a later stage after coding begins).</w:t>
       </w:r>
     </w:p>
     <w:p>
@@ -548,7 +548,7 @@
           <w:szCs w:val="20"/>
           <w:rtl w:val="0"/>
         </w:rPr>
-        <w:t>Listed the technologies to be used: LSTM predictor, reactive HPA baseline, PAKS adaptive engine/stability controller, GCT and Alibaba traces, Python evaluation harness, and Kubernetes dry-run Scale API shapes.</w:t>
+        <w:t>Listed the technologies that will be used: LSTM predictor, reactive HPA baseline, PAKS adaptive engine/stability controller, GCT and Alibaba traces, Python evaluation harness, and Kubernetes Scale API shapes for later fair comparison.</w:t>
       </w:r>
     </w:p>
     <w:p>
@@ -580,7 +580,7 @@
           <w:szCs w:val="20"/>
           <w:rtl w:val="0"/>
         </w:rPr>
-        <w:t>Prepared to show initial implementations from the paks-framework scaffolding: lambda_handler/app.py, lstm_predictor.py, adaptive_engine.py, scalers.py, train_lstm_and_evaluate.py, and supporting tests. Honest status: dry-run / scaffolding only; no finished live AWS results claimed.</w:t>
+        <w:t>Started planning how initial implementations will be shown once coding begins (predictor, adaptive engine, and HPA baseline comparison), responding to the requirement to demonstrate early code in upcoming sessions.</w:t>
       </w:r>
     </w:p>
     <w:p>
@@ -612,7 +612,7 @@
           <w:szCs w:val="20"/>
           <w:rtl w:val="0"/>
         </w:rPr>
-        <w:t>Prepared the next research-plan step: lock formal dry-run HPA vs PAKS comparison metrics on public traces (SLA, utilisation, scaling events, prediction error), then consider a small live k3s check only after dry-run numbers are stable.</w:t>
+        <w:t>Reviewed CA2 and related literature toward framework design: predictive autoscaling versus reactive HPA, and how to structure evaluation once implementation starts.</w:t>
       </w:r>
     </w:p>
     <w:p>

</xml_diff>